<commit_message>
feat: successful environment; updated xml templates, xsl, folders, and scripts; and successful generation of test cases
</commit_message>
<xml_diff>
--- a/inputs/2019/test_case.docx
+++ b/inputs/2019/test_case.docx
@@ -1,10 +1,10 @@
 
 <file path=word/document.xml><?xml version="1.0" encoding="utf-8"?>
-<w:document xmlns:wpc="http://schemas.microsoft.com/office/word/2010/wordprocessingCanvas" xmlns:cx="http://schemas.microsoft.com/office/drawing/2014/chartex" xmlns:cx1="http://schemas.microsoft.com/office/drawing/2015/9/8/chartex" xmlns:cx2="http://schemas.microsoft.com/office/drawing/2015/10/21/chartex" xmlns:cx3="http://schemas.microsoft.com/office/drawing/2016/5/9/chartex" xmlns:cx4="http://schemas.microsoft.com/office/drawing/2016/5/10/chartex" xmlns:cx5="http://schemas.microsoft.com/office/drawing/2016/5/11/chartex" xmlns:cx6="http://schemas.microsoft.com/office/drawing/2016/5/12/chartex" xmlns:cx7="http://schemas.microsoft.com/office/drawing/2016/5/13/chartex" xmlns:cx8="http://schemas.microsoft.com/office/drawing/2016/5/14/chartex" xmlns:mc="http://schemas.openxmlformats.org/markup-compatibility/2006" xmlns:aink="http://schemas.microsoft.com/office/drawing/2016/ink" xmlns:am3d="http://schemas.microsoft.com/office/drawing/2017/model3d" xmlns:o="urn:schemas-microsoft-com:office:office" xmlns:oel="http://schemas.microsoft.com/office/2019/extlst" xmlns:r="http://schemas.openxmlformats.org/officeDocument/2006/relationships" xmlns:m="http://schemas.openxmlformats.org/officeDocument/2006/math" xmlns:v="urn:schemas-microsoft-com:vml" xmlns:wp14="http://schemas.microsoft.com/office/word/2010/wordprocessingDrawing" xmlns:wp="http://schemas.openxmlformats.org/drawingml/2006/wordprocessingDrawing" xmlns:w10="urn:schemas-microsoft-com:office:word" xmlns:w="http://schemas.openxmlformats.org/wordprocessingml/2006/main" xmlns:w14="http://schemas.microsoft.com/office/word/2010/wordml" xmlns:w15="http://schemas.microsoft.com/office/word/2012/wordml" xmlns:w16cex="http://schemas.microsoft.com/office/word/2018/wordml/cex" xmlns:w16cid="http://schemas.microsoft.com/office/word/2016/wordml/cid" xmlns:w16="http://schemas.microsoft.com/office/word/2018/wordml" xmlns:w16du="http://schemas.microsoft.com/office/word/2023/wordml/word16du" xmlns:w16sdtdh="http://schemas.microsoft.com/office/word/2020/wordml/sdtdatahash" xmlns:w16se="http://schemas.microsoft.com/office/word/2015/wordml/symex" xmlns:wpg="http://schemas.microsoft.com/office/word/2010/wordprocessingGroup" xmlns:wpi="http://schemas.microsoft.com/office/word/2010/wordprocessingInk" xmlns:wne="http://schemas.microsoft.com/office/word/2006/wordml" xmlns:wps="http://schemas.microsoft.com/office/word/2010/wordprocessingShape" mc:Ignorable="w14 w15 w16se w16cid w16 w16cex w16sdtdh w16du wp14">
+<w:document xmlns:wpc="http://schemas.microsoft.com/office/word/2010/wordprocessingCanvas" xmlns:cx="http://schemas.microsoft.com/office/drawing/2014/chartex" xmlns:cx1="http://schemas.microsoft.com/office/drawing/2015/9/8/chartex" xmlns:cx2="http://schemas.microsoft.com/office/drawing/2015/10/21/chartex" xmlns:cx3="http://schemas.microsoft.com/office/drawing/2016/5/9/chartex" xmlns:cx4="http://schemas.microsoft.com/office/drawing/2016/5/10/chartex" xmlns:cx5="http://schemas.microsoft.com/office/drawing/2016/5/11/chartex" xmlns:cx6="http://schemas.microsoft.com/office/drawing/2016/5/12/chartex" xmlns:cx7="http://schemas.microsoft.com/office/drawing/2016/5/13/chartex" xmlns:cx8="http://schemas.microsoft.com/office/drawing/2016/5/14/chartex" xmlns:mc="http://schemas.openxmlformats.org/markup-compatibility/2006" xmlns:aink="http://schemas.microsoft.com/office/drawing/2016/ink" xmlns:am3d="http://schemas.microsoft.com/office/drawing/2017/model3d" xmlns:o="urn:schemas-microsoft-com:office:office" xmlns:oel="http://schemas.microsoft.com/office/2019/extlst" xmlns:r="http://schemas.openxmlformats.org/officeDocument/2006/relationships" xmlns:m="http://schemas.openxmlformats.org/officeDocument/2006/math" xmlns:v="urn:schemas-microsoft-com:vml" xmlns:wp14="http://schemas.microsoft.com/office/word/2010/wordprocessingDrawing" xmlns:wp="http://schemas.openxmlformats.org/drawingml/2006/wordprocessingDrawing" xmlns:w10="urn:schemas-microsoft-com:office:word" xmlns:w="http://schemas.openxmlformats.org/wordprocessingml/2006/main" xmlns:w14="http://schemas.microsoft.com/office/word/2010/wordml" xmlns:w15="http://schemas.microsoft.com/office/word/2012/wordml" xmlns:w16cex="http://schemas.microsoft.com/office/word/2018/wordml/cex" xmlns:w16cid="http://schemas.microsoft.com/office/word/2016/wordml/cid" xmlns:w16="http://schemas.microsoft.com/office/word/2018/wordml" xmlns:w16du="http://schemas.microsoft.com/office/word/2023/wordml/word16du" xmlns:w16sdtdh="http://schemas.microsoft.com/office/word/2020/wordml/sdtdatahash" xmlns:w16sdtfl="http://schemas.microsoft.com/office/word/2024/wordml/sdtformatlock" xmlns:w16se="http://schemas.microsoft.com/office/word/2015/wordml/symex" xmlns:wpg="http://schemas.microsoft.com/office/word/2010/wordprocessingGroup" xmlns:wpi="http://schemas.microsoft.com/office/word/2010/wordprocessingInk" xmlns:wne="http://schemas.microsoft.com/office/word/2006/wordml" xmlns:wps="http://schemas.microsoft.com/office/word/2010/wordprocessingShape" mc:Ignorable="w14 w15 w16se w16cid w16 w16cex w16sdtdh w16sdtfl w16du wp14">
   <w:body>
     <w:p>
       <w:pPr>
-        <w:pStyle w:val="Heading1"/>
+        <w:pStyle w:val="datapoint"/>
       </w:pPr>
       <w:r>
         <w:t>case number</w:t>
@@ -17,7 +17,7 @@
     </w:p>
     <w:p>
       <w:pPr>
-        <w:pStyle w:val="Heading1"/>
+        <w:pStyle w:val="datapoint"/>
       </w:pPr>
       <w:r>
         <w:t>summary</w:t>
@@ -30,7 +30,7 @@
     </w:p>
     <w:p>
       <w:pPr>
-        <w:pStyle w:val="Heading1"/>
+        <w:pStyle w:val="datapoint"/>
       </w:pPr>
       <w:r>
         <w:t>researcher</w:t>
@@ -43,16 +43,20 @@
     </w:p>
     <w:p>
       <w:pPr>
-        <w:pStyle w:val="Heading1"/>
+        <w:pStyle w:val="datapoint"/>
       </w:pPr>
       <w:r>
         <w:t>reviewer and date</w:t>
       </w:r>
     </w:p>
-    <w:p/>
-    <w:p>
-      <w:pPr>
-        <w:pStyle w:val="Heading1"/>
+    <w:p>
+      <w:pPr>
+        <w:pStyle w:val="datapoint"/>
+      </w:pPr>
+    </w:p>
+    <w:p>
+      <w:pPr>
+        <w:pStyle w:val="datapoint"/>
       </w:pPr>
       <w:r>
         <w:t>DATE RENDERED</w:t>
@@ -60,7 +64,7 @@
     </w:p>
     <w:p>
       <w:pPr>
-        <w:pStyle w:val="Heading1"/>
+        <w:pStyle w:val="datapoint"/>
       </w:pPr>
       <w:r>
         <w:t>appeal of</w:t>
@@ -68,7 +72,7 @@
     </w:p>
     <w:p>
       <w:pPr>
-        <w:pStyle w:val="Heading1"/>
+        <w:pStyle w:val="datapoint"/>
       </w:pPr>
       <w:r>
         <w:t>judges/commissioners</w:t>
@@ -81,7 +85,7 @@
     </w:p>
     <w:p>
       <w:pPr>
-        <w:pStyle w:val="Heading1"/>
+        <w:pStyle w:val="datapoint"/>
       </w:pPr>
       <w:r>
         <w:t>party 1 title</w:t>
@@ -94,7 +98,7 @@
     </w:p>
     <w:p>
       <w:pPr>
-        <w:pStyle w:val="Heading1"/>
+        <w:pStyle w:val="datapoint"/>
       </w:pPr>
       <w:r>
         <w:t>party 1 name(s)</w:t>
@@ -107,7 +111,7 @@
     </w:p>
     <w:p>
       <w:pPr>
-        <w:pStyle w:val="Heading1"/>
+        <w:pStyle w:val="datapoint"/>
       </w:pPr>
       <w:r>
         <w:t>party 2 title</w:t>
@@ -120,7 +124,7 @@
     </w:p>
     <w:p>
       <w:pPr>
-        <w:pStyle w:val="Heading1"/>
+        <w:pStyle w:val="datapoint"/>
       </w:pPr>
       <w:r>
         <w:t>party 2 name(s)</w:t>
@@ -133,7 +137,7 @@
     </w:p>
     <w:p>
       <w:pPr>
-        <w:pStyle w:val="Heading1"/>
+        <w:pStyle w:val="datapoint"/>
       </w:pPr>
       <w:r>
         <w:t>stage of appeal</w:t>
@@ -146,7 +150,7 @@
     </w:p>
     <w:p>
       <w:pPr>
-        <w:pStyle w:val="Heading1"/>
+        <w:pStyle w:val="datapoint"/>
       </w:pPr>
       <w:r>
         <w:t>facts</w:t>
@@ -159,7 +163,7 @@
     </w:p>
     <w:p>
       <w:pPr>
-        <w:pStyle w:val="Heading1"/>
+        <w:pStyle w:val="datapoint"/>
       </w:pPr>
       <w:r>
         <w:lastRenderedPageBreak/>
@@ -173,7 +177,7 @@
     </w:p>
     <w:p>
       <w:pPr>
-        <w:pStyle w:val="Heading1"/>
+        <w:pStyle w:val="datapoint"/>
       </w:pPr>
       <w:r>
         <w:t>conclusion</w:t>
@@ -186,7 +190,7 @@
     </w:p>
     <w:p>
       <w:pPr>
-        <w:pStyle w:val="Heading1"/>
+        <w:pStyle w:val="datapoint"/>
       </w:pPr>
       <w:r>
         <w:t>holding</w:t>
@@ -194,7 +198,7 @@
     </w:p>
     <w:p>
       <w:pPr>
-        <w:pStyle w:val="Heading1"/>
+        <w:pStyle w:val="datapoint"/>
       </w:pPr>
       <w:r>
         <w:t>disposition</w:t>
@@ -203,7 +207,7 @@
     <w:p/>
     <w:p>
       <w:pPr>
-        <w:pStyle w:val="Heading1"/>
+        <w:pStyle w:val="datapoint"/>
       </w:pPr>
       <w:r>
         <w:t>rule</w:t>
@@ -211,7 +215,7 @@
     </w:p>
     <w:p>
       <w:pPr>
-        <w:pStyle w:val="Heading1"/>
+        <w:pStyle w:val="datapoint"/>
       </w:pPr>
       <w:r>
         <w:t>category/topic/keywords</w:t>
@@ -219,7 +223,7 @@
     </w:p>
     <w:p>
       <w:pPr>
-        <w:pStyle w:val="Heading1"/>
+        <w:pStyle w:val="datapoint"/>
       </w:pPr>
       <w:r>
         <w:t>oneida constitution citations</w:t>
@@ -227,7 +231,7 @@
     </w:p>
     <w:p>
       <w:pPr>
-        <w:pStyle w:val="Heading1"/>
+        <w:pStyle w:val="datapoint"/>
       </w:pPr>
       <w:r>
         <w:t xml:space="preserve">oneida </w:t>
@@ -238,7 +242,7 @@
     </w:p>
     <w:p>
       <w:pPr>
-        <w:pStyle w:val="Heading1"/>
+        <w:pStyle w:val="datapoint"/>
       </w:pPr>
       <w:r>
         <w:t xml:space="preserve">oneida </w:t>
@@ -249,7 +253,7 @@
     </w:p>
     <w:p>
       <w:pPr>
-        <w:pStyle w:val="Heading1"/>
+        <w:pStyle w:val="datapoint"/>
       </w:pPr>
       <w:r>
         <w:t>foreign courts citations</w:t>
@@ -257,7 +261,7 @@
     </w:p>
     <w:p>
       <w:pPr>
-        <w:pStyle w:val="Heading1"/>
+        <w:pStyle w:val="datapoint"/>
       </w:pPr>
       <w:r>
         <w:t>other citations</w:t>
@@ -265,7 +269,7 @@
     </w:p>
     <w:p>
       <w:pPr>
-        <w:pStyle w:val="Heading1"/>
+        <w:pStyle w:val="datapoint"/>
       </w:pPr>
       <w:r>
         <w:t>jurisdiction</w:t>
@@ -273,7 +277,7 @@
     </w:p>
     <w:p>
       <w:pPr>
-        <w:pStyle w:val="Heading1"/>
+        <w:pStyle w:val="datapoint"/>
       </w:pPr>
       <w:r>
         <w:t>dissent</w:t>
@@ -281,7 +285,7 @@
     </w:p>
     <w:p>
       <w:pPr>
-        <w:pStyle w:val="Heading1"/>
+        <w:pStyle w:val="datapoint"/>
       </w:pPr>
       <w:r>
         <w:t>publish in reporter?</w:t>
@@ -289,7 +293,7 @@
     </w:p>
     <w:p>
       <w:pPr>
-        <w:pStyle w:val="Heading1"/>
+        <w:pStyle w:val="datapoint"/>
       </w:pPr>
       <w:r>
         <w:t>questions/notes</w:t>
@@ -297,7 +301,7 @@
     </w:p>
     <w:p>
       <w:pPr>
-        <w:pStyle w:val="Heading1"/>
+        <w:pStyle w:val="datapoint"/>
       </w:pPr>
       <w:r>
         <w:t>quotes</w:t>
@@ -305,7 +309,7 @@
     </w:p>
     <w:p>
       <w:pPr>
-        <w:pStyle w:val="Heading1"/>
+        <w:pStyle w:val="datapoint"/>
       </w:pPr>
       <w:r>
         <w:t>this case citation</w:t>
@@ -313,7 +317,7 @@
     </w:p>
     <w:p>
       <w:pPr>
-        <w:pStyle w:val="Heading1"/>
+        <w:pStyle w:val="datapoint"/>
       </w:pPr>
       <w:r>
         <w:t>historical citation</w:t>
@@ -330,7 +334,7 @@
 </file>
 
 <file path=word/styles.xml><?xml version="1.0" encoding="utf-8"?>
-<w:styles xmlns:mc="http://schemas.openxmlformats.org/markup-compatibility/2006" xmlns:r="http://schemas.openxmlformats.org/officeDocument/2006/relationships" xmlns:w="http://schemas.openxmlformats.org/wordprocessingml/2006/main" xmlns:w14="http://schemas.microsoft.com/office/word/2010/wordml" xmlns:w15="http://schemas.microsoft.com/office/word/2012/wordml" xmlns:w16cex="http://schemas.microsoft.com/office/word/2018/wordml/cex" xmlns:w16cid="http://schemas.microsoft.com/office/word/2016/wordml/cid" xmlns:w16="http://schemas.microsoft.com/office/word/2018/wordml" xmlns:w16du="http://schemas.microsoft.com/office/word/2023/wordml/word16du" xmlns:w16sdtdh="http://schemas.microsoft.com/office/word/2020/wordml/sdtdatahash" xmlns:w16se="http://schemas.microsoft.com/office/word/2015/wordml/symex" mc:Ignorable="w14 w15 w16se w16cid w16 w16cex w16sdtdh w16du">
+<w:styles xmlns:mc="http://schemas.openxmlformats.org/markup-compatibility/2006" xmlns:r="http://schemas.openxmlformats.org/officeDocument/2006/relationships" xmlns:w="http://schemas.openxmlformats.org/wordprocessingml/2006/main" xmlns:w14="http://schemas.microsoft.com/office/word/2010/wordml" xmlns:w15="http://schemas.microsoft.com/office/word/2012/wordml" xmlns:w16cex="http://schemas.microsoft.com/office/word/2018/wordml/cex" xmlns:w16cid="http://schemas.microsoft.com/office/word/2016/wordml/cid" xmlns:w16="http://schemas.microsoft.com/office/word/2018/wordml" xmlns:w16du="http://schemas.microsoft.com/office/word/2023/wordml/word16du" xmlns:w16sdtdh="http://schemas.microsoft.com/office/word/2020/wordml/sdtdatahash" xmlns:w16sdtfl="http://schemas.microsoft.com/office/word/2024/wordml/sdtformatlock" xmlns:w16se="http://schemas.microsoft.com/office/word/2015/wordml/symex" mc:Ignorable="w14 w15 w16se w16cid w16 w16cex w16sdtdh w16sdtfl w16du">
   <w:docDefaults>
     <w:rPrDefault>
       <w:rPr>
@@ -1377,6 +1381,28 @@
       <w:outlineLvl w:val="9"/>
     </w:pPr>
   </w:style>
+  <w:style w:type="paragraph" w:customStyle="1" w:styleId="datapoint">
+    <w:name w:val="datapoint"/>
+    <w:basedOn w:val="Heading1"/>
+    <w:link w:val="datapointChar"/>
+    <w:qFormat/>
+    <w:rsid w:val="009747C4"/>
+  </w:style>
+  <w:style w:type="character" w:customStyle="1" w:styleId="datapointChar">
+    <w:name w:val="datapoint Char"/>
+    <w:basedOn w:val="Heading1Char"/>
+    <w:link w:val="datapoint"/>
+    <w:rsid w:val="009747C4"/>
+    <w:rPr>
+      <w:rFonts w:ascii="Georgia" w:eastAsiaTheme="majorEastAsia" w:hAnsi="Georgia" w:cstheme="majorBidi"/>
+      <w:b/>
+      <w:bCs/>
+      <w:caps/>
+      <w:spacing w:val="4"/>
+      <w:sz w:val="28"/>
+      <w:szCs w:val="28"/>
+    </w:rPr>
+  </w:style>
 </w:styles>
 </file>
 

</xml_diff>